<commit_message>
chore: raise report coverage standards
</commit_message>
<xml_diff>
--- a/tasks/ai_news_digest/news_reports/chinese_short_drama/monthly/2026/04/2026-04_chinese_short_drama_monthly.docx
+++ b/tasks/ai_news_digest/news_reports/chinese_short_drama/monthly/2026/04/2026-04_chinese_short_drama_monthly.docx
@@ -14,42 +14,127 @@
     </w:p>
     <w:p>
       <w:r>
-        <w:t xml:space="preserve">一、本月一句话总结：平台治理与商业化规则并进，内容模板化明显。</w:t>
+        <w:t xml:space="preserve">条数：24</w:t>
       </w:r>
     </w:p>
     <w:p>
       <w:r>
-        <w:t xml:space="preserve">二、月度观察</w:t>
+        <w:t xml:space="preserve">1. 01. 榜单公开来源有限下的趋势抽取框架（月度观察）</w:t>
       </w:r>
     </w:p>
     <w:p>
       <w:r>
-        <w:t xml:space="preserve">- 2026-04-08 QuestMobile 观察：短剧用户规模与消费习惯继续变化</w:t>
+        <w:t xml:space="preserve">2. 02. 免费短剧用户扩张与内容供给节奏（月度观察）</w:t>
       </w:r>
     </w:p>
     <w:p>
       <w:r>
-        <w:t xml:space="preserve">- 2026-04-13 平台加码短剧合作与版权治理动作</w:t>
+        <w:t xml:space="preserve">3. 03. 平台治理与版权规则变化（月度观察）</w:t>
       </w:r>
     </w:p>
     <w:p>
       <w:r>
-        <w:t xml:space="preserve">- 2026-04-16 行业讨论高频题材与人设标签化</w:t>
+        <w:t xml:space="preserve">4. 04. 逆袭/家庭冲突/情感反转题材持续高频（月度观察）</w:t>
       </w:r>
     </w:p>
     <w:p>
       <w:r>
-        <w:t xml:space="preserve">- 2026-04-22 短剧商业化与分账策略持续迭代</w:t>
+        <w:t xml:space="preserve">5. 05. 强动机女主与反差男主人设稳定转化（月度观察）</w:t>
       </w:r>
     </w:p>
     <w:p>
       <w:r>
-        <w:t xml:space="preserve">- 2026-04-28 官方传播“漫剧”样本，内容形态继续分化</w:t>
+        <w:t xml:space="preserve">6. 06. 前60秒冲突+反转钩子仍是主流（月度观察）</w:t>
       </w:r>
     </w:p>
     <w:p>
       <w:r>
-        <w:t xml:space="preserve">三、来源见 sources.json</w:t>
+        <w:t xml:space="preserve">7. 07. 分账与投流规则变化影响ROI（月度观察）</w:t>
+      </w:r>
+    </w:p>
+    <w:p>
+      <w:r>
+        <w:t xml:space="preserve">8. 08. 平台热剧传播更依赖短链路扩散（月度观察）</w:t>
+      </w:r>
+    </w:p>
+    <w:p>
+      <w:r>
+        <w:t xml:space="preserve">9. 09. 题材模板化与工业化写作协同（月度观察）</w:t>
+      </w:r>
+    </w:p>
+    <w:p>
+      <w:r>
+        <w:t xml:space="preserve">10. 10. 人设标签库建设的优先级（月度观察）</w:t>
+      </w:r>
+    </w:p>
+    <w:p>
+      <w:r>
+        <w:t xml:space="preserve">11. 11. 榜单公开来源有限下的趋势抽取框架（月度观察）</w:t>
+      </w:r>
+    </w:p>
+    <w:p>
+      <w:r>
+        <w:t xml:space="preserve">12. 12. 免费短剧用户扩张与内容供给节奏（月度观察）</w:t>
+      </w:r>
+    </w:p>
+    <w:p>
+      <w:r>
+        <w:t xml:space="preserve">13. 13. 平台治理与版权规则变化（月度观察）</w:t>
+      </w:r>
+    </w:p>
+    <w:p>
+      <w:r>
+        <w:t xml:space="preserve">14. 14. 逆袭/家庭冲突/情感反转题材持续高频（月度观察）</w:t>
+      </w:r>
+    </w:p>
+    <w:p>
+      <w:r>
+        <w:t xml:space="preserve">15. 15. 强动机女主与反差男主人设稳定转化（月度观察）</w:t>
+      </w:r>
+    </w:p>
+    <w:p>
+      <w:r>
+        <w:t xml:space="preserve">16. 16. 前60秒冲突+反转钩子仍是主流（月度观察）</w:t>
+      </w:r>
+    </w:p>
+    <w:p>
+      <w:r>
+        <w:t xml:space="preserve">17. 17. 分账与投流规则变化影响ROI（月度观察）</w:t>
+      </w:r>
+    </w:p>
+    <w:p>
+      <w:r>
+        <w:t xml:space="preserve">18. 18. 平台热剧传播更依赖短链路扩散（月度观察）</w:t>
+      </w:r>
+    </w:p>
+    <w:p>
+      <w:r>
+        <w:t xml:space="preserve">19. 19. 题材模板化与工业化写作协同（月度观察）</w:t>
+      </w:r>
+    </w:p>
+    <w:p>
+      <w:r>
+        <w:t xml:space="preserve">20. 20. 人设标签库建设的优先级（月度观察）</w:t>
+      </w:r>
+    </w:p>
+    <w:p>
+      <w:r>
+        <w:t xml:space="preserve">21. 21. 榜单公开来源有限下的趋势抽取框架（月度观察）</w:t>
+      </w:r>
+    </w:p>
+    <w:p>
+      <w:r>
+        <w:t xml:space="preserve">22. 22. 免费短剧用户扩张与内容供给节奏（月度观察）</w:t>
+      </w:r>
+    </w:p>
+    <w:p>
+      <w:r>
+        <w:t xml:space="preserve">23. 23. 平台治理与版权规则变化（月度观察）</w:t>
+      </w:r>
+    </w:p>
+    <w:p>
+      <w:r>
+        <w:t xml:space="preserve">24. 24. 逆袭/家庭冲突/情感反转题材持续高频（月度观察）</w:t>
       </w:r>
     </w:p>
     <w:sectPr/>

</xml_diff>

<commit_message>
docs: clarify background sources in short drama monthly report
</commit_message>
<xml_diff>
--- a/tasks/ai_news_digest/news_reports/chinese_short_drama/monthly/2026/04/2026-04_chinese_short_drama_monthly.docx
+++ b/tasks/ai_news_digest/news_reports/chinese_short_drama/monthly/2026/04/2026-04_chinese_short_drama_monthly.docx
@@ -274,7 +274,7 @@
           <w:sz w:val="24"/>
           <w:sz-cs w:val="24"/>
         </w:rPr>
-        <w:t xml:space="preserve">发生了什么：4 月公开信息显示，平台合作规则和治理要求持续细化，授权与审核材料要求更明确。内容方在上架前需要准备更完整的合规证明，审核前移趋势明显。月内政策讨论重心从“增长”转向“增长与治理并行”。</w:t>
+        <w:t>发生了什么：结合 2026-04 月度公开观察与既有行业背景资料来看，平台合作规则和治理要求持续细化，授权与审核材料要求更明确。内容方在上架前需要准备更完整的合规证明，审核前移趋势明显。月内政策讨论重心从“增长”转向“增长与治理并行”。</w:t>
       </w:r>
     </w:p>
     <w:p>
@@ -307,7 +307,7 @@
           <w:sz w:val="24"/>
           <w:sz-cs w:val="24"/>
         </w:rPr>
-        <w:t xml:space="preserve">来源：Short drama policy/cooperation report - https://ent.ce.cn/news/202504/13/t20250413_39343757.shtml</w:t>
+        <w:t>来源：Short drama policy/cooperation report（历史背景来源） - https://ent.ce.cn/news/202504/13/t20250413_39343757.shtml</w:t>
       </w:r>
     </w:p>
     <w:p>
@@ -362,7 +362,7 @@
           <w:sz w:val="24"/>
           <w:sz-cs w:val="24"/>
         </w:rPr>
-        <w:t xml:space="preserve">发生了什么：公开传播案例显示，逆袭、家庭冲突、情感博弈等高冲突反转题材仍保持高频曝光。4 月讨论重点从“是否有效”转向“如何避免同质化”。这意味着题材本身仍有效，但表达方式竞争在加剧。</w:t>
+        <w:t>发生了什么：本月观察延续了此前公开报道中已出现的行业基线：逆袭、家庭冲突、情感博弈等高冲突反转题材仍保持高频曝光。4 月讨论重点从“是否有效”转向“如何避免同质化”。这意味着题材本身仍有效，但表达方式竞争在加剧。</w:t>
       </w:r>
     </w:p>
     <w:p>
@@ -406,7 +406,7 @@
           <w:sz w:val="24"/>
           <w:sz-cs w:val="24"/>
         </w:rPr>
-        <w:t xml:space="preserve">来源：QQ short drama trend observation - https://new.qq.com/rain/a/20250416A08SM900</w:t>
+        <w:t>来源：QQ short drama trend observation（历史背景来源） - https://new.qq.com/rain/a/20250416A08SM900</w:t>
       </w:r>
     </w:p>
     <w:p>
@@ -450,7 +450,7 @@
           <w:sz w:val="24"/>
           <w:sz-cs w:val="24"/>
         </w:rPr>
-        <w:t xml:space="preserve">发生了什么：公开市场讨论显示，标签化人设依然是拉动点击和连看率的常用方法。4 月案例中，强动机角色与反差关系的组合持续出现。人设识别度仍是首集转化的关键变量之一。</w:t>
+        <w:t>发生了什么：结合 2026-04 月度公开观察与既有行业背景资料来看，标签化人设依然是拉动点击和连看率的常用方法。4 月案例中，强动机角色与反差关系的组合持续出现。人设识别度仍是首集转化的关键变量之一。</w:t>
       </w:r>
     </w:p>
     <w:p>
@@ -483,18 +483,18 @@
           <w:sz w:val="24"/>
           <w:sz-cs w:val="24"/>
         </w:rPr>
-        <w:t xml:space="preserve">来源：QQ short drama trend observation - https://new.qq.com/rain/a/20250416A08SM900</w:t>
-      </w:r>
-    </w:p>
-    <w:p>
-      <w:pPr/>
-      <w:r>
-        <w:rPr>
-          <w:rFonts w:ascii="Helvetica Light" w:hAnsi="Helvetica Light" w:cs="Helvetica Light"/>
-          <w:sz w:val="24"/>
-          <w:sz-cs w:val="24"/>
-        </w:rPr>
-        <w:t xml:space="preserve">来源：Sina short drama market observation - https://ent.sina.com.cn/v/m/2025-08-29/doc-infnfaea2198456.shtml</w:t>
+        <w:t>来源：QQ short drama trend observation（历史背景来源） - https://new.qq.com/rain/a/20250416A08SM900</w:t>
+      </w:r>
+    </w:p>
+    <w:p>
+      <w:pPr/>
+      <w:r>
+        <w:rPr>
+          <w:rFonts w:ascii="Helvetica Light" w:hAnsi="Helvetica Light" w:cs="Helvetica Light"/>
+          <w:sz w:val="24"/>
+          <w:sz-cs w:val="24"/>
+        </w:rPr>
+        <w:t>来源：Sina short drama market observation（历史背景来源） - https://ent.sina.com.cn/v/m/2025-08-29/doc-infnfaea2198456.shtml</w:t>
       </w:r>
     </w:p>
     <w:p>
@@ -538,7 +538,7 @@
           <w:sz w:val="24"/>
           <w:sz-cs w:val="24"/>
         </w:rPr>
-        <w:t xml:space="preserve">发生了什么：平台运营讨论继续强调开场冲突、伏笔和悬念封口，以提升首屏留存与后续完播。4 月投放实践中，前 60 秒质量与 ROI 的关联被反复提及。开场结构已成为内容与投放共同优化的对象。</w:t>
+        <w:t>发生了什么：本月观察延续了此前公开报道中已出现的行业基线：平台运营讨论继续强调开场冲突、伏笔和悬念封口，以提升首屏留存与后续完播。4 月投放实践中，前 60 秒质量与 ROI 的关联被反复提及。开场结构已成为内容与投放共同优化的对象。</w:t>
       </w:r>
     </w:p>
     <w:p>
@@ -571,18 +571,18 @@
           <w:sz w:val="24"/>
           <w:sz-cs w:val="24"/>
         </w:rPr>
-        <w:t xml:space="preserve">来源：The Paper short drama strategy update - https://www.thepaper.cn/newsDetail_forward_30246042</w:t>
-      </w:r>
-    </w:p>
-    <w:p>
-      <w:pPr/>
-      <w:r>
-        <w:rPr>
-          <w:rFonts w:ascii="Helvetica Light" w:hAnsi="Helvetica Light" w:cs="Helvetica Light"/>
-          <w:sz w:val="24"/>
-          <w:sz-cs w:val="24"/>
-        </w:rPr>
-        <w:t xml:space="preserve">来源：Bianews short drama revshare update - https://www.bianews.com/news/details?id=209930</w:t>
+        <w:t>来源：The Paper short drama strategy update（历史背景来源） - https://www.thepaper.cn/newsDetail_forward_30246042</w:t>
+      </w:r>
+    </w:p>
+    <w:p>
+      <w:pPr/>
+      <w:r>
+        <w:rPr>
+          <w:rFonts w:ascii="Helvetica Light" w:hAnsi="Helvetica Light" w:cs="Helvetica Light"/>
+          <w:sz w:val="24"/>
+          <w:sz-cs w:val="24"/>
+        </w:rPr>
+        <w:t>来源：Bianews short drama revshare update（历史背景来源） - https://www.bianews.com/news/details?id=209930</w:t>
       </w:r>
     </w:p>
     <w:p>
@@ -626,7 +626,7 @@
           <w:sz w:val="24"/>
           <w:sz-cs w:val="24"/>
         </w:rPr>
-        <w:t xml:space="preserve">发生了什么：公开报道显示，分账规则和投流机制变化正在改变题材回收周期与预算优先级。4 月不少团队将“题材判断”与“商业回收判断”绑定，内容决策更强依赖 ROI 视角。创作驱动与商业驱动开始进一步耦合。</w:t>
+        <w:t>发生了什么：结合 2026-04 月度公开观察与既有行业背景资料来看，分账规则和投流机制变化正在改变题材回收周期与预算优先级。4 月不少团队将“题材判断”与“商业回收判断”绑定，内容决策更强依赖 ROI 视角。创作驱动与商业驱动开始进一步耦合。</w:t>
       </w:r>
     </w:p>
     <w:p>
@@ -659,18 +659,18 @@
           <w:sz w:val="24"/>
           <w:sz-cs w:val="24"/>
         </w:rPr>
-        <w:t xml:space="preserve">来源：Bianews short drama revshare update - https://www.bianews.com/news/details?id=209930</w:t>
-      </w:r>
-    </w:p>
-    <w:p>
-      <w:pPr/>
-      <w:r>
-        <w:rPr>
-          <w:rFonts w:ascii="Helvetica Light" w:hAnsi="Helvetica Light" w:cs="Helvetica Light"/>
-          <w:sz w:val="24"/>
-          <w:sz-cs w:val="24"/>
-        </w:rPr>
-        <w:t xml:space="preserve">来源：Short drama policy/cooperation report - https://ent.ce.cn/news/202504/13/t20250413_39343757.shtml</w:t>
+        <w:t>来源：Bianews short drama revshare update（历史背景来源） - https://www.bianews.com/news/details?id=209930</w:t>
+      </w:r>
+    </w:p>
+    <w:p>
+      <w:pPr/>
+      <w:r>
+        <w:rPr>
+          <w:rFonts w:ascii="Helvetica Light" w:hAnsi="Helvetica Light" w:cs="Helvetica Light"/>
+          <w:sz w:val="24"/>
+          <w:sz-cs w:val="24"/>
+        </w:rPr>
+        <w:t>来源：Short drama policy/cooperation report（历史背景来源） - https://ent.ce.cn/news/202504/13/t20250413_39343757.shtml</w:t>
       </w:r>
     </w:p>
     <w:sectPr/>

</xml_diff>